<commit_message>
fixed button functionality for customer and staff management in the admin's panel, unregistered users find a salon directory page fixed with salon_id traversing
</commit_message>
<xml_diff>
--- a/Advanced_WebDesign.docx
+++ b/Advanced_WebDesign.docx
@@ -783,13 +783,13 @@
         </w:rPr>
       </w:pPr>
     </w:p>
-    <w:bookmarkStart w:id="29" w:name="_Toc230641408" w:displacedByCustomXml="next"/>
-    <w:bookmarkStart w:id="30" w:name="_Toc230641337" w:displacedByCustomXml="next"/>
-    <w:bookmarkStart w:id="31" w:name="_Toc230641052" w:displacedByCustomXml="next"/>
+    <w:bookmarkStart w:id="29" w:name="_Toc231072984" w:displacedByCustomXml="next"/>
+    <w:bookmarkStart w:id="30" w:name="_Toc231073023" w:displacedByCustomXml="next"/>
+    <w:bookmarkStart w:id="31" w:name="_Toc230783093" w:displacedByCustomXml="next"/>
     <w:bookmarkStart w:id="32" w:name="_Toc231045854" w:displacedByCustomXml="next"/>
-    <w:bookmarkStart w:id="33" w:name="_Toc230783093" w:displacedByCustomXml="next"/>
-    <w:bookmarkStart w:id="34" w:name="_Toc231073023" w:displacedByCustomXml="next"/>
-    <w:bookmarkStart w:id="35" w:name="_Toc231072984" w:displacedByCustomXml="next"/>
+    <w:bookmarkStart w:id="33" w:name="_Toc230641052" w:displacedByCustomXml="next"/>
+    <w:bookmarkStart w:id="34" w:name="_Toc230641337" w:displacedByCustomXml="next"/>
+    <w:bookmarkStart w:id="35" w:name="_Toc230641408" w:displacedByCustomXml="next"/>
     <w:sdt>
       <w:sdtPr>
         <w:rPr>
@@ -4599,6 +4599,7 @@
       <w:r>
         <w:rPr>
           <w:rFonts w:ascii="Arial" w:hAnsi="Arial" w:cs="Arial"/>
+          <w:noProof/>
           <w:lang w:val="en-US"/>
         </w:rPr>
         <w:drawing>
@@ -5898,6 +5899,7 @@
       <w:r>
         <w:rPr>
           <w:rFonts w:ascii="Arial" w:hAnsi="Arial" w:cs="Arial"/>
+          <w:noProof/>
           <w:lang w:val="en-US"/>
         </w:rPr>
         <w:drawing>
@@ -6633,6 +6635,7 @@
       <w:r>
         <w:rPr>
           <w:rFonts w:ascii="Arial" w:hAnsi="Arial" w:cs="Arial"/>
+          <w:noProof/>
         </w:rPr>
         <w:lastRenderedPageBreak/>
         <w:drawing>
@@ -7533,6 +7536,7 @@
       <w:r>
         <w:rPr>
           <w:rFonts w:ascii="Arial" w:hAnsi="Arial" w:cs="Arial"/>
+          <w:noProof/>
           <w:lang w:val="en-US"/>
         </w:rPr>
         <w:drawing>
@@ -7960,14 +7964,13 @@
     </w:p>
     <w:p>
       <w:pPr>
-        <w:rPr>
-          <w:lang w:val="en-US"/>
-        </w:rPr>
-      </w:pPr>
-    </w:p>
-    <w:p>
-      <w:pPr>
-        <w:rPr>
+        <w:pStyle w:val="Heading1"/>
+        <w:rPr>
+          <w:b/>
+          <w:bCs/>
+          <w:color w:val="auto"/>
+          <w:sz w:val="36"/>
+          <w:szCs w:val="36"/>
           <w:lang w:val="en-US"/>
         </w:rPr>
       </w:pPr>
@@ -8095,10 +8098,40 @@
     <w:p>
       <w:pPr>
         <w:rPr>
-          <w:rFonts w:ascii="Arial" w:hAnsi="Arial" w:cs="Arial"/>
-          <w:lang w:val="en-US"/>
-        </w:rPr>
-      </w:pPr>
+          <w:lang w:val="en-US"/>
+        </w:rPr>
+      </w:pPr>
+    </w:p>
+    <w:p>
+      <w:pPr>
+        <w:rPr>
+          <w:lang w:val="en-US"/>
+        </w:rPr>
+      </w:pPr>
+    </w:p>
+    <w:p>
+      <w:pPr>
+        <w:pStyle w:val="Heading1"/>
+        <w:rPr>
+          <w:b/>
+          <w:bCs/>
+          <w:color w:val="auto"/>
+          <w:sz w:val="36"/>
+          <w:szCs w:val="36"/>
+          <w:lang w:val="en-US"/>
+        </w:rPr>
+      </w:pPr>
+      <w:r>
+        <w:rPr>
+          <w:b/>
+          <w:bCs/>
+          <w:color w:val="auto"/>
+          <w:sz w:val="36"/>
+          <w:szCs w:val="36"/>
+          <w:lang w:val="en-US"/>
+        </w:rPr>
+        <w:t>Week 6:</w:t>
+      </w:r>
     </w:p>
     <w:p>
       <w:pPr>
@@ -8962,8 +8995,305 @@
         </w:rPr>
       </w:pPr>
     </w:p>
+    <w:p>
+      <w:pPr>
+        <w:pStyle w:val="Heading1"/>
+        <w:rPr>
+          <w:b/>
+          <w:bCs/>
+          <w:color w:val="auto"/>
+          <w:sz w:val="36"/>
+          <w:szCs w:val="36"/>
+          <w:lang w:val="en-US"/>
+        </w:rPr>
+      </w:pPr>
+      <w:r>
+        <w:rPr>
+          <w:b/>
+          <w:bCs/>
+          <w:color w:val="auto"/>
+          <w:sz w:val="36"/>
+          <w:szCs w:val="36"/>
+          <w:lang w:val="en-US"/>
+        </w:rPr>
+        <w:t>Week 7: User Authentication and Session Management</w:t>
+      </w:r>
+    </w:p>
+    <w:p>
+      <w:pPr>
+        <w:rPr>
+          <w:lang w:val="en-US"/>
+        </w:rPr>
+      </w:pPr>
+    </w:p>
+    <w:p>
+      <w:pPr>
+        <w:pStyle w:val="Heading2"/>
+        <w:rPr>
+          <w:sz w:val="28"/>
+          <w:szCs w:val="28"/>
+          <w:lang w:val="en-US"/>
+        </w:rPr>
+      </w:pPr>
+      <w:r>
+        <w:rPr>
+          <w:sz w:val="28"/>
+          <w:szCs w:val="28"/>
+          <w:lang w:val="en-US"/>
+        </w:rPr>
+        <w:t>Customer Authentication:</w:t>
+      </w:r>
+    </w:p>
+    <w:p>
+      <w:pPr>
+        <w:rPr>
+          <w:lang w:val="en-US"/>
+        </w:rPr>
+      </w:pPr>
+      <w:r>
+        <w:rPr>
+          <w:lang w:val="en-US"/>
+        </w:rPr>
+        <w:drawing>
+          <wp:inline distT="0" distB="0" distL="0" distR="0" wp14:anchorId="12E894F2" wp14:editId="448C39B0">
+            <wp:extent cx="2838450" cy="2133600"/>
+            <wp:effectExtent l="0" t="0" r="0" b="0"/>
+            <wp:docPr id="15" name="Picture 15"/>
+            <wp:cNvGraphicFramePr>
+              <a:graphicFrameLocks xmlns:a="http://schemas.openxmlformats.org/drawingml/2006/main" noChangeAspect="1"/>
+            </wp:cNvGraphicFramePr>
+            <a:graphic xmlns:a="http://schemas.openxmlformats.org/drawingml/2006/main">
+              <a:graphicData uri="http://schemas.openxmlformats.org/drawingml/2006/picture">
+                <pic:pic xmlns:pic="http://schemas.openxmlformats.org/drawingml/2006/picture">
+                  <pic:nvPicPr>
+                    <pic:cNvPr id="1" name=""/>
+                    <pic:cNvPicPr/>
+                  </pic:nvPicPr>
+                  <pic:blipFill>
+                    <a:blip r:embed="rId44"/>
+                    <a:stretch>
+                      <a:fillRect/>
+                    </a:stretch>
+                  </pic:blipFill>
+                  <pic:spPr>
+                    <a:xfrm>
+                      <a:off x="0" y="0"/>
+                      <a:ext cx="2838854" cy="2133904"/>
+                    </a:xfrm>
+                    <a:prstGeom prst="rect">
+                      <a:avLst/>
+                    </a:prstGeom>
+                  </pic:spPr>
+                </pic:pic>
+              </a:graphicData>
+            </a:graphic>
+          </wp:inline>
+        </w:drawing>
+      </w:r>
+      <w:r>
+        <w:rPr>
+          <w:lang w:val="en-US"/>
+        </w:rPr>
+        <w:drawing>
+          <wp:inline distT="0" distB="0" distL="0" distR="0" wp14:anchorId="3A3B02FF" wp14:editId="509C7CAA">
+            <wp:extent cx="5731510" cy="1873250"/>
+            <wp:effectExtent l="0" t="0" r="2540" b="0"/>
+            <wp:docPr id="16" name="Picture 16"/>
+            <wp:cNvGraphicFramePr>
+              <a:graphicFrameLocks xmlns:a="http://schemas.openxmlformats.org/drawingml/2006/main" noChangeAspect="1"/>
+            </wp:cNvGraphicFramePr>
+            <a:graphic xmlns:a="http://schemas.openxmlformats.org/drawingml/2006/main">
+              <a:graphicData uri="http://schemas.openxmlformats.org/drawingml/2006/picture">
+                <pic:pic xmlns:pic="http://schemas.openxmlformats.org/drawingml/2006/picture">
+                  <pic:nvPicPr>
+                    <pic:cNvPr id="1" name=""/>
+                    <pic:cNvPicPr/>
+                  </pic:nvPicPr>
+                  <pic:blipFill>
+                    <a:blip r:embed="rId45"/>
+                    <a:stretch>
+                      <a:fillRect/>
+                    </a:stretch>
+                  </pic:blipFill>
+                  <pic:spPr>
+                    <a:xfrm>
+                      <a:off x="0" y="0"/>
+                      <a:ext cx="5731510" cy="1873250"/>
+                    </a:xfrm>
+                    <a:prstGeom prst="rect">
+                      <a:avLst/>
+                    </a:prstGeom>
+                  </pic:spPr>
+                </pic:pic>
+              </a:graphicData>
+            </a:graphic>
+          </wp:inline>
+        </w:drawing>
+      </w:r>
+    </w:p>
+    <w:p>
+      <w:pPr>
+        <w:pStyle w:val="Heading3"/>
+        <w:rPr>
+          <w:color w:val="auto"/>
+          <w:lang w:val="en-US"/>
+        </w:rPr>
+      </w:pPr>
+      <w:r>
+        <w:rPr>
+          <w:color w:val="auto"/>
+          <w:lang w:val="en-US"/>
+        </w:rPr>
+        <w:t>Fig 7.1: User login and dashboard</w:t>
+      </w:r>
+    </w:p>
+    <w:p>
+      <w:pPr>
+        <w:rPr>
+          <w:lang w:val="en-US"/>
+        </w:rPr>
+      </w:pPr>
+    </w:p>
+    <w:p>
+      <w:pPr>
+        <w:rPr>
+          <w:lang w:val="en-US"/>
+        </w:rPr>
+      </w:pPr>
+    </w:p>
+    <w:p>
+      <w:pPr>
+        <w:pStyle w:val="Heading2"/>
+        <w:rPr>
+          <w:sz w:val="28"/>
+          <w:szCs w:val="28"/>
+          <w:lang w:val="en-US"/>
+        </w:rPr>
+      </w:pPr>
+      <w:r>
+        <w:rPr>
+          <w:sz w:val="28"/>
+          <w:szCs w:val="28"/>
+          <w:lang w:val="en-US"/>
+        </w:rPr>
+        <w:lastRenderedPageBreak/>
+        <w:t>Admin Authentication</w:t>
+      </w:r>
+    </w:p>
+    <w:p>
+      <w:pPr>
+        <w:rPr>
+          <w:lang w:val="en-US"/>
+        </w:rPr>
+      </w:pPr>
+      <w:r>
+        <w:rPr>
+          <w:lang w:val="en-US"/>
+        </w:rPr>
+        <w:drawing>
+          <wp:inline distT="0" distB="0" distL="0" distR="0" wp14:anchorId="00264D88" wp14:editId="67F89E26">
+            <wp:extent cx="3429000" cy="2609850"/>
+            <wp:effectExtent l="0" t="0" r="0" b="0"/>
+            <wp:docPr id="19" name="Picture 19"/>
+            <wp:cNvGraphicFramePr>
+              <a:graphicFrameLocks xmlns:a="http://schemas.openxmlformats.org/drawingml/2006/main" noChangeAspect="1"/>
+            </wp:cNvGraphicFramePr>
+            <a:graphic xmlns:a="http://schemas.openxmlformats.org/drawingml/2006/main">
+              <a:graphicData uri="http://schemas.openxmlformats.org/drawingml/2006/picture">
+                <pic:pic xmlns:pic="http://schemas.openxmlformats.org/drawingml/2006/picture">
+                  <pic:nvPicPr>
+                    <pic:cNvPr id="1" name=""/>
+                    <pic:cNvPicPr/>
+                  </pic:nvPicPr>
+                  <pic:blipFill>
+                    <a:blip r:embed="rId46"/>
+                    <a:stretch>
+                      <a:fillRect/>
+                    </a:stretch>
+                  </pic:blipFill>
+                  <pic:spPr>
+                    <a:xfrm>
+                      <a:off x="0" y="0"/>
+                      <a:ext cx="3429484" cy="2610218"/>
+                    </a:xfrm>
+                    <a:prstGeom prst="rect">
+                      <a:avLst/>
+                    </a:prstGeom>
+                  </pic:spPr>
+                </pic:pic>
+              </a:graphicData>
+            </a:graphic>
+          </wp:inline>
+        </w:drawing>
+      </w:r>
+    </w:p>
+    <w:p>
+      <w:pPr>
+        <w:rPr>
+          <w:lang w:val="en-US"/>
+        </w:rPr>
+      </w:pPr>
+      <w:r>
+        <w:rPr>
+          <w:lang w:val="en-US"/>
+        </w:rPr>
+        <w:drawing>
+          <wp:inline distT="0" distB="0" distL="0" distR="0" wp14:anchorId="3875D3EC" wp14:editId="51F91832">
+            <wp:extent cx="5731510" cy="2428240"/>
+            <wp:effectExtent l="0" t="0" r="2540" b="0"/>
+            <wp:docPr id="18" name="Picture 18"/>
+            <wp:cNvGraphicFramePr>
+              <a:graphicFrameLocks xmlns:a="http://schemas.openxmlformats.org/drawingml/2006/main" noChangeAspect="1"/>
+            </wp:cNvGraphicFramePr>
+            <a:graphic xmlns:a="http://schemas.openxmlformats.org/drawingml/2006/main">
+              <a:graphicData uri="http://schemas.openxmlformats.org/drawingml/2006/picture">
+                <pic:pic xmlns:pic="http://schemas.openxmlformats.org/drawingml/2006/picture">
+                  <pic:nvPicPr>
+                    <pic:cNvPr id="1" name=""/>
+                    <pic:cNvPicPr/>
+                  </pic:nvPicPr>
+                  <pic:blipFill>
+                    <a:blip r:embed="rId47"/>
+                    <a:stretch>
+                      <a:fillRect/>
+                    </a:stretch>
+                  </pic:blipFill>
+                  <pic:spPr>
+                    <a:xfrm>
+                      <a:off x="0" y="0"/>
+                      <a:ext cx="5731510" cy="2428240"/>
+                    </a:xfrm>
+                    <a:prstGeom prst="rect">
+                      <a:avLst/>
+                    </a:prstGeom>
+                  </pic:spPr>
+                </pic:pic>
+              </a:graphicData>
+            </a:graphic>
+          </wp:inline>
+        </w:drawing>
+      </w:r>
+    </w:p>
+    <w:p>
+      <w:pPr>
+        <w:pStyle w:val="Heading3"/>
+        <w:rPr>
+          <w:rFonts w:ascii="Arial" w:hAnsi="Arial" w:cs="Arial"/>
+          <w:color w:val="auto"/>
+          <w:lang w:val="en-US"/>
+        </w:rPr>
+      </w:pPr>
+      <w:r>
+        <w:rPr>
+          <w:rFonts w:ascii="Arial" w:hAnsi="Arial" w:cs="Arial"/>
+          <w:color w:val="auto"/>
+          <w:lang w:val="en-US"/>
+        </w:rPr>
+        <w:t>Fig 7.2: Admin authentication and dashboard</w:t>
+      </w:r>
+    </w:p>
     <w:sectPr>
-      <w:footerReference w:type="default" r:id="rId44"/>
+      <w:footerReference w:type="default" r:id="rId48"/>
       <w:pgSz w:w="11906" w:h="16838"/>
       <w:pgMar w:top="1440" w:right="1440" w:bottom="1440" w:left="1440" w:header="708" w:footer="708" w:gutter="0"/>
       <w:cols w:space="708"/>

</xml_diff>